<commit_message>
Refonte visuelle, correctifs suppression/renommage de site, quota et cahier des charges
</commit_message>
<xml_diff>
--- a/cahier-des-charges-vigie.docx
+++ b/cahier-des-charges-vigie.docx
@@ -863,6 +863,187 @@
     <w:p>
       <w:r>
         <w:t>Ces fonctionnalités relèvent d'une autre famille d'outils (analytics et error-tracking) que la supervision de disponibilité, et nécessitent une architecture différente : SDK/script à intégrer sur le site du client, API de collecte d'événements, et gestion du consentement (données personnelles des visiteurs).</w:t>
+      </w:r>
+    </w:p>
+    <w:p>
+      <w:pPr>
+        <w:pStyle w:val="Heading2"/>
+      </w:pPr>
+      <w:r>
+        <w:t>4.4 Monitoring de performance et de résilience applicative (nouvelle évolution, hors MVP)</w:t>
+      </w:r>
+    </w:p>
+    <w:p>
+      <w:r>
+        <w:t>Le monitoring ne se limite pas à détecter les pannes : il permet aussi de prévenir les incidents en observant les signaux de dégradation avant qu'ils ne deviennent bloquants pour l'utilisateur.</w:t>
+      </w:r>
+    </w:p>
+    <w:p>
+      <w:pPr>
+        <w:pStyle w:val="Heading3"/>
+      </w:pPr>
+      <w:r>
+        <w:t>a) Extensions du script de suivi déjà en place (mesure côté navigateur réel — RUM)</w:t>
+      </w:r>
+    </w:p>
+    <w:p>
+      <w:pPr>
+        <w:pStyle w:val="ListParagraph"/>
+        <w:numPr>
+          <w:ilvl w:val="0"/>
+          <w:numId w:val="2"/>
+        </w:numPr>
+      </w:pPr>
+      <w:r>
+        <w:t>Temps de chargement réel des pages (indicateurs Web Vitals : affichage, interactivité, stabilité visuelle)</w:t>
+      </w:r>
+    </w:p>
+    <w:p>
+      <w:pPr>
+        <w:pStyle w:val="ListParagraph"/>
+        <w:numPr>
+          <w:ilvl w:val="0"/>
+          <w:numId w:val="2"/>
+        </w:numPr>
+      </w:pPr>
+      <w:r>
+        <w:t>Rapidité d'exécution des scripts, temps de chargement des images et des appels API côté client</w:t>
+      </w:r>
+    </w:p>
+    <w:p>
+      <w:pPr>
+        <w:pStyle w:val="ListParagraph"/>
+        <w:numPr>
+          <w:ilvl w:val="0"/>
+          <w:numId w:val="2"/>
+        </w:numPr>
+      </w:pPr>
+      <w:r>
+        <w:t>Détection des erreurs réseau visibles depuis le navigateur (appels fetch/XHR en échec avec leur code HTTP, images ou ressources qui ne chargent pas), en complément des erreurs JavaScript déjà suivies — limité à ce qui est observable côté client, pas les logs internes du serveur</w:t>
+      </w:r>
+    </w:p>
+    <w:p>
+      <w:pPr>
+        <w:pStyle w:val="Heading3"/>
+      </w:pPr>
+      <w:r>
+        <w:t>b) Extensions du moteur de vérification existant (mesure côté serveur)</w:t>
+      </w:r>
+    </w:p>
+    <w:p>
+      <w:pPr>
+        <w:pStyle w:val="ListParagraph"/>
+        <w:numPr>
+          <w:ilvl w:val="0"/>
+          <w:numId w:val="2"/>
+        </w:numPr>
+      </w:pPr>
+      <w:r>
+        <w:t>Distinction des erreurs serveur (HTTP 5xx) des autres types de panne</w:t>
+      </w:r>
+    </w:p>
+    <w:p>
+      <w:pPr>
+        <w:pStyle w:val="ListParagraph"/>
+        <w:numPr>
+          <w:ilvl w:val="0"/>
+          <w:numId w:val="2"/>
+        </w:numPr>
+      </w:pPr>
+      <w:r>
+        <w:t>Suivi de la réactivité des composants applicatifs (API, back-end) avec seuils de latence configurables par endpoint</w:t>
+      </w:r>
+    </w:p>
+    <w:p>
+      <w:pPr>
+        <w:pStyle w:val="ListParagraph"/>
+        <w:numPr>
+          <w:ilvl w:val="0"/>
+          <w:numId w:val="2"/>
+        </w:numPr>
+      </w:pPr>
+      <w:r>
+        <w:t>Détection précoce des lenteurs progressives, avant qu'elles ne deviennent bloquantes</w:t>
+      </w:r>
+    </w:p>
+    <w:p>
+      <w:pPr>
+        <w:pStyle w:val="Heading3"/>
+      </w:pPr>
+      <w:r>
+        <w:t>c) Nouveaux chantiers (architecture à concevoir)</w:t>
+      </w:r>
+    </w:p>
+    <w:p>
+      <w:pPr>
+        <w:pStyle w:val="ListParagraph"/>
+        <w:numPr>
+          <w:ilvl w:val="0"/>
+          <w:numId w:val="2"/>
+        </w:numPr>
+      </w:pPr>
+      <w:r>
+        <w:t>Tests synthétiques de parcours utilisateurs critiques (ex. tunnel de commande, formulaire de contact) : nécessite un moteur d'automatisation capable de rejouer un scénario multi-étapes</w:t>
+      </w:r>
+    </w:p>
+    <w:p>
+      <w:pPr>
+        <w:pStyle w:val="ListParagraph"/>
+        <w:numPr>
+          <w:ilvl w:val="0"/>
+          <w:numId w:val="2"/>
+        </w:numPr>
+      </w:pPr>
+      <w:r>
+        <w:t>Tests de rendu responsive / affichage mobile</w:t>
+      </w:r>
+    </w:p>
+    <w:p>
+      <w:pPr>
+        <w:pStyle w:val="ListParagraph"/>
+        <w:numPr>
+          <w:ilvl w:val="0"/>
+          <w:numId w:val="2"/>
+        </w:numPr>
+      </w:pPr>
+      <w:r>
+        <w:t>Observation des pics de trafic et anomalies de performance (à partir des données de fréquentation déjà collectées)</w:t>
+      </w:r>
+    </w:p>
+    <w:p>
+      <w:pPr>
+        <w:pStyle w:val="ListParagraph"/>
+        <w:numPr>
+          <w:ilvl w:val="0"/>
+          <w:numId w:val="2"/>
+        </w:numPr>
+      </w:pPr>
+      <w:r>
+        <w:t>Identification des pages ou modules les plus coûteux en ressources</w:t>
+      </w:r>
+    </w:p>
+    <w:p>
+      <w:pPr>
+        <w:pStyle w:val="ListParagraph"/>
+        <w:numPr>
+          <w:ilvl w:val="0"/>
+          <w:numId w:val="2"/>
+        </w:numPr>
+      </w:pPr>
+      <w:r>
+        <w:t>Mesure de l'empreinte carbone par page ou action, pour orienter des choix techniques plus sobres (méthodologie à définir, ex. poids des pages × intensité carbone du réseau)</w:t>
+      </w:r>
+    </w:p>
+    <w:p>
+      <w:pPr>
+        <w:pStyle w:val="ListParagraph"/>
+        <w:numPr>
+          <w:ilvl w:val="0"/>
+          <w:numId w:val="2"/>
+        </w:numPr>
+      </w:pPr>
+      <w:r>
+        <w:t>Ingestion de vrais logs serveur (applicatifs, accès), à la manière d'un outil comme Loki : explicitement écarté pour l'instant — nécessiterait un agent ou une intégration côté serveur du client, une compétence technique que la cible PME n'a généralement pas, et une gestion de volumétrie conséquente. À reconsidérer uniquement si la demande émerge du segment "Startups et jeunes PME tech".</w:t>
       </w:r>
     </w:p>
     <w:p>

</xml_diff>